<commit_message>
Presentación web - objeto/campo de estudio, brecha normativa y resolución 2x
- Fuentes de consulta en evidencia (SGRT-IESS, DAIE-IESS, CAMICON)
- Bloque histórico 2014-2019/2024 con nota 508/16.067
- Objeto del estudio y campo de estudio bajo la jerarquía de controles
- Referencias normativas D.E. 255, AM-MDT-2025-122, AM-MDT-2024-196, C.D. 513
- Flecha horizontal conecta problema central con jerarquía de controles
- Compresión tipográfica del panel JUSTIFICACIÓN
- Ancho 1408px y zoom 2x para nitidez en pantalla completa
- Respaldo markdown del estado del proyecto
</commit_message>
<xml_diff>
--- a/probl.docx
+++ b/probl.docx
@@ -1,6 +1,6 @@
 
 <file path=word/document.xml><?xml version="1.0" encoding="utf-8"?>
-<w:document xmlns:wpc="http://schemas.microsoft.com/office/word/2010/wordprocessingCanvas" xmlns:cx="http://schemas.microsoft.com/office/drawing/2014/chartex" xmlns:cx1="http://schemas.microsoft.com/office/drawing/2015/9/8/chartex" xmlns:cx2="http://schemas.microsoft.com/office/drawing/2015/10/21/chartex" xmlns:cx3="http://schemas.microsoft.com/office/drawing/2016/5/9/chartex" xmlns:cx4="http://schemas.microsoft.com/office/drawing/2016/5/10/chartex" xmlns:cx5="http://schemas.microsoft.com/office/drawing/2016/5/11/chartex" xmlns:cx6="http://schemas.microsoft.com/office/drawing/2016/5/12/chartex" xmlns:cx7="http://schemas.microsoft.com/office/drawing/2016/5/13/chartex" xmlns:cx8="http://schemas.microsoft.com/office/drawing/2016/5/14/chartex" xmlns:mc="http://schemas.openxmlformats.org/markup-compatibility/2006" xmlns:aink="http://schemas.microsoft.com/office/drawing/2016/ink" xmlns:am3d="http://schemas.microsoft.com/office/drawing/2017/model3d" xmlns:o="urn:schemas-microsoft-com:office:office" xmlns:oel="http://schemas.microsoft.com/office/2019/extlst" xmlns:r="http://schemas.openxmlformats.org/officeDocument/2006/relationships" xmlns:m="http://schemas.openxmlformats.org/officeDocument/2006/math" xmlns:v="urn:schemas-microsoft-com:vml" xmlns:wp14="http://schemas.microsoft.com/office/word/2010/wordprocessingDrawing" xmlns:wp="http://schemas.openxmlformats.org/drawingml/2006/wordprocessingDrawing" xmlns:w10="urn:schemas-microsoft-com:office:word" xmlns:w="http://schemas.openxmlformats.org/wordprocessingml/2006/main" xmlns:w14="http://schemas.microsoft.com/office/word/2010/wordml" xmlns:w15="http://schemas.microsoft.com/office/word/2012/wordml" xmlns:w16cei="http://schemas.microsoft.com/office/word/2026/wordml/cei" xmlns:w16cex="http://schemas.microsoft.com/office/word/2018/wordml/cex" xmlns:w16cid="http://schemas.microsoft.com/office/word/2016/wordml/cid" xmlns:w16="http://schemas.microsoft.com/office/word/2018/wordml" xmlns:w16du="http://schemas.microsoft.com/office/word/2023/wordml/word16du" xmlns:w16sdtdh="http://schemas.microsoft.com/office/word/2020/wordml/sdtdatahash" xmlns:w16sdtfl="http://schemas.microsoft.com/office/word/2024/wordml/sdtformatlock" xmlns:w16se="http://schemas.microsoft.com/office/word/2015/wordml/symex" xmlns:wpg="http://schemas.microsoft.com/office/word/2010/wordprocessingGroup" xmlns:wpi="http://schemas.microsoft.com/office/word/2010/wordprocessingInk" xmlns:wne="http://schemas.microsoft.com/office/word/2006/wordml" xmlns:wps="http://schemas.microsoft.com/office/word/2010/wordprocessingShape" mc:Ignorable="w14 w15 w16se w16cid w16 w16cex w16sdtdh w16sdtfl w16du wp14">
+<w:document xmlns:wpc="http://schemas.microsoft.com/office/word/2010/wordprocessingCanvas" xmlns:cx="http://schemas.microsoft.com/office/drawing/2014/chartex" xmlns:cx1="http://schemas.microsoft.com/office/drawing/2015/9/8/chartex" xmlns:cx2="http://schemas.microsoft.com/office/drawing/2015/10/21/chartex" xmlns:cx3="http://schemas.microsoft.com/office/drawing/2016/5/9/chartex" xmlns:cx4="http://schemas.microsoft.com/office/drawing/2016/5/10/chartex" xmlns:cx5="http://schemas.microsoft.com/office/drawing/2016/5/11/chartex" xmlns:cx6="http://schemas.microsoft.com/office/drawing/2016/5/12/chartex" xmlns:cx7="http://schemas.microsoft.com/office/drawing/2016/5/13/chartex" xmlns:cx8="http://schemas.microsoft.com/office/drawing/2016/5/14/chartex" xmlns:mc="http://schemas.openxmlformats.org/markup-compatibility/2006" xmlns:aink="http://schemas.microsoft.com/office/drawing/2016/ink" xmlns:am3d="http://schemas.microsoft.com/office/drawing/2017/model3d" xmlns:o="urn:schemas-microsoft-com:office:office" xmlns:oel="http://schemas.microsoft.com/office/2019/extlst" xmlns:r="http://schemas.openxmlformats.org/officeDocument/2006/relationships" xmlns:m="http://schemas.openxmlformats.org/officeDocument/2006/math" xmlns:v="urn:schemas-microsoft-com:vml" xmlns:wp14="http://schemas.microsoft.com/office/word/2010/wordprocessingDrawing" xmlns:wp="http://schemas.openxmlformats.org/drawingml/2006/wordprocessingDrawing" xmlns:w10="urn:schemas-microsoft-com:office:word" xmlns:w="http://schemas.openxmlformats.org/wordprocessingml/2006/main" xmlns:w14="http://schemas.microsoft.com/office/word/2010/wordml" xmlns:w15="http://schemas.microsoft.com/office/word/2012/wordml" xmlns:w16cex="http://schemas.microsoft.com/office/word/2018/wordml/cex" xmlns:w16cid="http://schemas.microsoft.com/office/word/2016/wordml/cid" xmlns:w16="http://schemas.microsoft.com/office/word/2018/wordml" xmlns:w16du="http://schemas.microsoft.com/office/word/2023/wordml/word16du" xmlns:w16sdtdh="http://schemas.microsoft.com/office/word/2020/wordml/sdtdatahash" xmlns:w16sdtfl="http://schemas.microsoft.com/office/word/2024/wordml/sdtformatlock" xmlns:w16se="http://schemas.microsoft.com/office/word/2015/wordml/symex" xmlns:wpg="http://schemas.microsoft.com/office/word/2010/wordprocessingGroup" xmlns:wpi="http://schemas.microsoft.com/office/word/2010/wordprocessingInk" xmlns:wne="http://schemas.microsoft.com/office/word/2006/wordml" xmlns:wps="http://schemas.microsoft.com/office/word/2010/wordprocessingShape" mc:Ignorable="w14 w15 w16se w16cid w16 w16cex w16sdtdh w16sdtfl w16du wp14">
   <w:body>
     <w:p>
       <w:pPr>
@@ -2418,7 +2418,21 @@
         <w:rPr>
           <w:color w:val="000000"/>
         </w:rPr>
-        <w:t>controles de ingeniería constituye una oportunidad concreta para reducir tanto la frecuencia como la severidad de los accidentes en obra. Actividades como los trabajos en altura, las excavaciones, el izaje de cargas y la interacción con equipos pesados, señaladas por la</w:t>
+        <w:t xml:space="preserve">controles de ingeniería constituye una oportunidad concreta para reducir tanto la frecuencia como la severidad de los accidentes en obra. Actividades como los trabajos en altura, las excavaciones, el </w:t>
+      </w:r>
+      <w:proofErr w:type="spellStart"/>
+      <w:r>
+        <w:rPr>
+          <w:color w:val="000000"/>
+        </w:rPr>
+        <w:t>izaje</w:t>
+      </w:r>
+      <w:proofErr w:type="spellEnd"/>
+      <w:r>
+        <w:rPr>
+          <w:color w:val="000000"/>
+        </w:rPr>
+        <w:t xml:space="preserve"> de cargas y la interacción con equipos pesados, señaladas por la</w:t>
       </w:r>
       <w:r>
         <w:rPr>
@@ -3424,6 +3438,109 @@
         <w:t>En esta perspectiva, el desarrollo de una metodología que incorpore los controles de ingeniería como parte estructural de la gestión del proyecto representa una contribución de especial valor dentro del campo de estudio, al integrar la prevención en las etapas de inicio, planificación, ejecución, seguimiento y control. Este enfoque permite mejorar la toma de decisiones, orientar de manera más coherente la asignación de recursos y reducir la ocurrencia de incidentes que afectan el cumplimiento de plazos, costos y niveles de calidad en los proyectos. Así, la investigación refleja el interés personal de aportar una herramienta útil, técnica y contextualizada para el sector, promoviendo proyectos más seguros, más organizados y alineados con prácticas contemporáneas de dirección de proyectos. El propósito final es evidenciar que la gestión de proyectos puede constituirse en el espacio desde el cual la prevención se estructura, se planifica y se consolida como un componente estratégico para el éxito del proyecto y el bienestar de quienes participan en su ejecución.</w:t>
       </w:r>
     </w:p>
+    <w:p>
+      <w:pPr>
+        <w:pStyle w:val="Ttulo2"/>
+        <w:numPr>
+          <w:ilvl w:val="1"/>
+          <w:numId w:val="2"/>
+        </w:numPr>
+        <w:spacing w:before="240" w:after="240"/>
+      </w:pPr>
+      <w:bookmarkStart w:id="14" w:name="_Toc235442585"/>
+      <w:r>
+        <w:t xml:space="preserve">Objeto de </w:t>
+      </w:r>
+      <w:r>
+        <w:t>e</w:t>
+      </w:r>
+      <w:r>
+        <w:t>studio</w:t>
+      </w:r>
+      <w:r>
+        <w:t>.</w:t>
+      </w:r>
+      <w:bookmarkEnd w:id="14"/>
+    </w:p>
+    <w:p>
+      <w:pPr>
+        <w:pStyle w:val="APA7"/>
+      </w:pPr>
+      <w:r>
+        <w:t xml:space="preserve">El objeto de estudio de la presente investigación se centró en la estructuración de una estrategia metodológica de gestión de proyectos basada en controles de ingeniería, orientada a la mejora de las condiciones de seguridad laboral y la prevención de riesgos en proyectos de construcción de edificaciones e infraestructura básica en la ciudad de Quito, en conformidad con la normativa ecuatoriana vigente entre 2024 y 2026. Para ello, se sustentó en la elaboración de cuestionarios de verificación basados en la NTP 324, destinados a determinar los niveles de deficiencia (ND) de los factores de riesgo derivados de los procesos constructivos, los cuales constituyeron el insumo técnico para la evaluación de riesgos laborales mediante la metodología NTP 330. A partir de estos resultados, se desarrollaron Análisis de Riesgo en el Trabajo (ART) que permitieron </w:t>
+      </w:r>
+      <w:r>
+        <w:lastRenderedPageBreak/>
+        <w:t>establecer criterios técnicos para la definición de controles de ingeniería aplicables a las actividades de mayor criticidad presentes en los proyectos de construcción.</w:t>
+      </w:r>
+    </w:p>
+    <w:p>
+      <w:pPr>
+        <w:pStyle w:val="APA7"/>
+      </w:pPr>
+      <w:r>
+        <w:t>En esta perspectiva, el objeto de estudio, más allá de la valoración aislada de riesgos, se orientó a integrar la seguridad dentro de la planificación, organización y dirección del proyecto, evitando que la prevención quedara relegada únicamente a la etapa de ejecución en obra. La metodología propuesta se integró desde las fases iniciales del proyecto, como los anteproyectos, los diseños y los términos de referencia, en coherencia con lo establecido en el AM-MDT-2025-122, de modo que los riesgos se anticiparan y las decisiones técnicas se formularan con mayor sustento preventivo. De esta manera, la investigación aportó una herramienta metodológica práctica y contextualizada que permitió a empresas constructoras, consultoras, fiscalizadores y demás actores del proceso constructivo cumplir con la normativa ecuatoriana, fortalecer la gestión preventiva, mejorar las condiciones de seguridad laboral y promover una participación más coordinada y responsable de todos los involucrados en el desarrollo de los proyectos.</w:t>
+      </w:r>
+    </w:p>
+    <w:p>
+      <w:pPr>
+        <w:pStyle w:val="Ttulo2"/>
+        <w:numPr>
+          <w:ilvl w:val="1"/>
+          <w:numId w:val="2"/>
+        </w:numPr>
+        <w:spacing w:before="240" w:after="240"/>
+      </w:pPr>
+      <w:bookmarkStart w:id="15" w:name="_Toc235442586"/>
+      <w:r>
+        <w:t>Campo de acción</w:t>
+      </w:r>
+      <w:r>
+        <w:t>.</w:t>
+      </w:r>
+      <w:bookmarkEnd w:id="15"/>
+    </w:p>
+    <w:p>
+      <w:pPr>
+        <w:pStyle w:val="APA7"/>
+        <w:rPr>
+          <w:color w:val="000000" w:themeColor="text1"/>
+        </w:rPr>
+      </w:pPr>
+      <w:r>
+        <w:rPr>
+          <w:color w:val="000000" w:themeColor="text1"/>
+        </w:rPr>
+        <w:t>El campo de acción de la presente investigación se desarrolló en proyectos de construcción de edificaciones e infraestructura básica ubicados en la ciudad de Quito, tanto en el ámbito público como privado, incluyendo proyectos inmobiliarios de oficinas, viviendas y obras de infraestructura básica. En este contexto, la investigación se orientó a la aplicación de una estrategia metodológica de gestión de proyectos basada en controles de ingeniería, dirigida a la mejora de las condiciones de seguridad laboral y a la prevención de riesgos durante las distintas fases del proceso constructivo, en conformidad con la normativa ecuatoriana vigente entre 2024 y 2026.</w:t>
+      </w:r>
+    </w:p>
+    <w:p>
+      <w:pPr>
+        <w:pStyle w:val="APA7"/>
+        <w:rPr>
+          <w:color w:val="000000" w:themeColor="text1"/>
+        </w:rPr>
+      </w:pPr>
+      <w:r>
+        <w:rPr>
+          <w:color w:val="000000" w:themeColor="text1"/>
+        </w:rPr>
+        <w:t xml:space="preserve">De manera específica, el campo de acción comprende los procesos organizativos, técnicos y operativos a través de los cuales se planifica, coordina, ejecuta y controla la seguridad en obra, involucrando a los distintos actores que participan en el desarrollo de los proyectos, tales como empleadores, consultores, fiscalizadores, equipos técnicos y trabajadores. En este sentido, la investigación se desarrolla dentro del marco técnico y legal vigente en el Ecuador, tomando como referencia decretos ejecutivos, reglamentos, acuerdos ministeriales, resoluciones y normas técnicas </w:t>
+      </w:r>
+      <w:r>
+        <w:rPr>
+          <w:color w:val="000000" w:themeColor="text1"/>
+        </w:rPr>
+        <w:lastRenderedPageBreak/>
+        <w:t xml:space="preserve">aplicables a la seguridad y salud en el trabajo. </w:t>
+      </w:r>
+      <w:r>
+        <w:rPr>
+          <w:color w:val="000000" w:themeColor="text1"/>
+        </w:rPr>
+        <w:t>A partir de ello, la metodología propuesta adquirió aplicabilidad directa en proyectos de distinta escala y complejidad dentro de la ciudad de Quito, constituyéndose en una guía técnica orientada a anticipar riesgos, fortalecer la coordinación entre actores, mejorar la toma de decisiones preventivas y contribuir al desarrollo de obras más seguras, ordenadas y eficientes.</w:t>
+      </w:r>
+    </w:p>
     <w:p/>
     <w:sectPr>
       <w:pgSz w:w="11906" w:h="16838"/>
@@ -3436,7 +3553,7 @@
 </file>
 
 <file path=word/numbering.xml><?xml version="1.0" encoding="utf-8"?>
-<w:numbering xmlns:wpc="http://schemas.microsoft.com/office/word/2010/wordprocessingCanvas" xmlns:cx="http://schemas.microsoft.com/office/drawing/2014/chartex" xmlns:cx1="http://schemas.microsoft.com/office/drawing/2015/9/8/chartex" xmlns:cx2="http://schemas.microsoft.com/office/drawing/2015/10/21/chartex" xmlns:cx3="http://schemas.microsoft.com/office/drawing/2016/5/9/chartex" xmlns:cx4="http://schemas.microsoft.com/office/drawing/2016/5/10/chartex" xmlns:cx5="http://schemas.microsoft.com/office/drawing/2016/5/11/chartex" xmlns:cx6="http://schemas.microsoft.com/office/drawing/2016/5/12/chartex" xmlns:cx7="http://schemas.microsoft.com/office/drawing/2016/5/13/chartex" xmlns:cx8="http://schemas.microsoft.com/office/drawing/2016/5/14/chartex" xmlns:mc="http://schemas.openxmlformats.org/markup-compatibility/2006" xmlns:aink="http://schemas.microsoft.com/office/drawing/2016/ink" xmlns:am3d="http://schemas.microsoft.com/office/drawing/2017/model3d" xmlns:o="urn:schemas-microsoft-com:office:office" xmlns:oel="http://schemas.microsoft.com/office/2019/extlst" xmlns:r="http://schemas.openxmlformats.org/officeDocument/2006/relationships" xmlns:m="http://schemas.openxmlformats.org/officeDocument/2006/math" xmlns:v="urn:schemas-microsoft-com:vml" xmlns:wp14="http://schemas.microsoft.com/office/word/2010/wordprocessingDrawing" xmlns:wp="http://schemas.openxmlformats.org/drawingml/2006/wordprocessingDrawing" xmlns:w10="urn:schemas-microsoft-com:office:word" xmlns:w="http://schemas.openxmlformats.org/wordprocessingml/2006/main" xmlns:w14="http://schemas.microsoft.com/office/word/2010/wordml" xmlns:w15="http://schemas.microsoft.com/office/word/2012/wordml" xmlns:w16cei="http://schemas.microsoft.com/office/word/2026/wordml/cei" xmlns:w16cex="http://schemas.microsoft.com/office/word/2018/wordml/cex" xmlns:w16cid="http://schemas.microsoft.com/office/word/2016/wordml/cid" xmlns:w16="http://schemas.microsoft.com/office/word/2018/wordml" xmlns:w16du="http://schemas.microsoft.com/office/word/2023/wordml/word16du" xmlns:w16sdtdh="http://schemas.microsoft.com/office/word/2020/wordml/sdtdatahash" xmlns:w16sdtfl="http://schemas.microsoft.com/office/word/2024/wordml/sdtformatlock" xmlns:w16se="http://schemas.microsoft.com/office/word/2015/wordml/symex" xmlns:wpg="http://schemas.microsoft.com/office/word/2010/wordprocessingGroup" xmlns:wpi="http://schemas.microsoft.com/office/word/2010/wordprocessingInk" xmlns:wne="http://schemas.microsoft.com/office/word/2006/wordml" xmlns:wps="http://schemas.microsoft.com/office/word/2010/wordprocessingShape" mc:Ignorable="w14 w15 w16se w16cid w16 w16cex w16sdtdh w16sdtfl w16du wp14">
+<w:numbering xmlns:wpc="http://schemas.microsoft.com/office/word/2010/wordprocessingCanvas" xmlns:cx="http://schemas.microsoft.com/office/drawing/2014/chartex" xmlns:cx1="http://schemas.microsoft.com/office/drawing/2015/9/8/chartex" xmlns:cx2="http://schemas.microsoft.com/office/drawing/2015/10/21/chartex" xmlns:cx3="http://schemas.microsoft.com/office/drawing/2016/5/9/chartex" xmlns:cx4="http://schemas.microsoft.com/office/drawing/2016/5/10/chartex" xmlns:cx5="http://schemas.microsoft.com/office/drawing/2016/5/11/chartex" xmlns:cx6="http://schemas.microsoft.com/office/drawing/2016/5/12/chartex" xmlns:cx7="http://schemas.microsoft.com/office/drawing/2016/5/13/chartex" xmlns:cx8="http://schemas.microsoft.com/office/drawing/2016/5/14/chartex" xmlns:mc="http://schemas.openxmlformats.org/markup-compatibility/2006" xmlns:aink="http://schemas.microsoft.com/office/drawing/2016/ink" xmlns:am3d="http://schemas.microsoft.com/office/drawing/2017/model3d" xmlns:o="urn:schemas-microsoft-com:office:office" xmlns:oel="http://schemas.microsoft.com/office/2019/extlst" xmlns:r="http://schemas.openxmlformats.org/officeDocument/2006/relationships" xmlns:m="http://schemas.openxmlformats.org/officeDocument/2006/math" xmlns:v="urn:schemas-microsoft-com:vml" xmlns:wp14="http://schemas.microsoft.com/office/word/2010/wordprocessingDrawing" xmlns:wp="http://schemas.openxmlformats.org/drawingml/2006/wordprocessingDrawing" xmlns:w10="urn:schemas-microsoft-com:office:word" xmlns:w="http://schemas.openxmlformats.org/wordprocessingml/2006/main" xmlns:w14="http://schemas.microsoft.com/office/word/2010/wordml" xmlns:w15="http://schemas.microsoft.com/office/word/2012/wordml" xmlns:w16cex="http://schemas.microsoft.com/office/word/2018/wordml/cex" xmlns:w16cid="http://schemas.microsoft.com/office/word/2016/wordml/cid" xmlns:w16="http://schemas.microsoft.com/office/word/2018/wordml" xmlns:w16du="http://schemas.microsoft.com/office/word/2023/wordml/word16du" xmlns:w16sdtdh="http://schemas.microsoft.com/office/word/2020/wordml/sdtdatahash" xmlns:w16sdtfl="http://schemas.microsoft.com/office/word/2024/wordml/sdtformatlock" xmlns:w16se="http://schemas.microsoft.com/office/word/2015/wordml/symex" xmlns:wpg="http://schemas.microsoft.com/office/word/2010/wordprocessingGroup" xmlns:wpi="http://schemas.microsoft.com/office/word/2010/wordprocessingInk" xmlns:wne="http://schemas.microsoft.com/office/word/2006/wordml" xmlns:wps="http://schemas.microsoft.com/office/word/2010/wordprocessingShape" mc:Ignorable="w14 w15 w16se w16cid w16 w16cex w16sdtdh w16sdtfl w16du wp14">
   <w:abstractNum w:abstractNumId="0" w15:restartNumberingAfterBreak="0">
     <w:nsid w:val="43E574FE"/>
     <w:multiLevelType w:val="hybridMultilevel"/>

</xml_diff>